<commit_message>
Finalize topic execution notes and smoke scripts
</commit_message>
<xml_diff>
--- a/docx/hf-topics/README.docx
+++ b/docx/hf-topics/README.docx
@@ -348,6 +348,85 @@
           <w:szCs w:val="24"/>
         </w:rPr>
         <w:t xml:space="preserve">: danh sách nguồn chính thống.</w:t>
+      </w:r>
+    </w:p>
+    <w:p>
+      <w:pPr>
+        <w:spacing w:after="140" w:line="360"/>
+        <w:jc w:val="both"/>
+      </w:pPr>
+      <w:r>
+        <w:rPr>
+          <w:rFonts w:ascii="Times New Roman" w:cs="Times New Roman" w:eastAsia="Times New Roman" w:hAnsi="Times New Roman"/>
+          <w:color w:val="1F1F1F"/>
+          <w:sz w:val="24"/>
+          <w:szCs w:val="24"/>
+        </w:rPr>
+        <w:t xml:space="preserve">Ngoài ra còn có:</w:t>
+      </w:r>
+    </w:p>
+    <w:p>
+      <w:pPr>
+        <w:pStyle w:val="ListParagraph"/>
+        <w:numPr>
+          <w:ilvl w:val="0"/>
+          <w:numId w:val="1"/>
+        </w:numPr>
+        <w:spacing w:after="80" w:line="320"/>
+      </w:pPr>
+      <w:r>
+        <w:rPr>
+          <w:rFonts w:ascii="Consolas" w:cs="Consolas" w:eastAsia="Consolas" w:hAnsi="Consolas"/>
+          <w:color w:val="2F3A46"/>
+          <w:sz w:val="22"/>
+          <w:szCs w:val="22"/>
+        </w:rPr>
+        <w:t xml:space="preserve">execution-status.md</w:t>
+      </w:r>
+      <w:r>
+        <w:rPr>
+          <w:rFonts w:ascii="Times New Roman" w:cs="Times New Roman" w:eastAsia="Times New Roman" w:hAnsi="Times New Roman"/>
+          <w:color w:val="1F1F1F"/>
+          <w:sz w:val="24"/>
+          <w:szCs w:val="24"/>
+        </w:rPr>
+        <w:t xml:space="preserve">: nhật ký chạy thực tế cho </w:t>
+      </w:r>
+      <w:r>
+        <w:rPr>
+          <w:rFonts w:ascii="Consolas" w:cs="Consolas" w:eastAsia="Consolas" w:hAnsi="Consolas"/>
+          <w:color w:val="2F3A46"/>
+          <w:sz w:val="22"/>
+          <w:szCs w:val="22"/>
+        </w:rPr>
+        <w:t xml:space="preserve">DNABERT-2</w:t>
+      </w:r>
+      <w:r>
+        <w:rPr>
+          <w:rFonts w:ascii="Times New Roman" w:cs="Times New Roman" w:eastAsia="Times New Roman" w:hAnsi="Times New Roman"/>
+          <w:color w:val="1F1F1F"/>
+          <w:sz w:val="24"/>
+          <w:szCs w:val="24"/>
+        </w:rPr>
+        <w:t xml:space="preserve"> và </w:t>
+      </w:r>
+      <w:r>
+        <w:rPr>
+          <w:rFonts w:ascii="Consolas" w:cs="Consolas" w:eastAsia="Consolas" w:hAnsi="Consolas"/>
+          <w:color w:val="2F3A46"/>
+          <w:sz w:val="22"/>
+          <w:szCs w:val="22"/>
+        </w:rPr>
+        <w:t xml:space="preserve">Gengram</w:t>
+      </w:r>
+      <w:r>
+        <w:rPr>
+          <w:rFonts w:ascii="Times New Roman" w:cs="Times New Roman" w:eastAsia="Times New Roman" w:hAnsi="Times New Roman"/>
+          <w:color w:val="1F1F1F"/>
+          <w:sz w:val="24"/>
+          <w:szCs w:val="24"/>
+        </w:rPr>
+        <w:t xml:space="preserve">, gồm môi trường, bước đã chạy, kết quả, và blocker.</w:t>
       </w:r>
     </w:p>
     <w:p>
@@ -696,7 +775,43 @@
                 <w:sz w:val="24"/>
                 <w:szCs w:val="24"/>
               </w:rPr>
-              <w:t xml:space="preserve"> có bộ nhớ dài hạn</w:t>
+              <w:t xml:space="preserve"> có </w:t>
+            </w:r>
+            <w:r>
+              <w:rPr>
+                <w:rFonts w:ascii="Consolas" w:cs="Consolas" w:eastAsia="Consolas" w:hAnsi="Consolas"/>
+                <w:color w:val="2F3A46"/>
+                <w:sz w:val="22"/>
+                <w:szCs w:val="22"/>
+              </w:rPr>
+              <w:t xml:space="preserve">retrieval</w:t>
+            </w:r>
+            <w:r>
+              <w:rPr>
+                <w:rFonts w:ascii="Times New Roman" w:cs="Times New Roman" w:eastAsia="Times New Roman" w:hAnsi="Times New Roman"/>
+                <w:color w:val="1F1F1F"/>
+                <w:sz w:val="24"/>
+                <w:szCs w:val="24"/>
+              </w:rPr>
+              <w:t xml:space="preserve"> và </w:t>
+            </w:r>
+            <w:r>
+              <w:rPr>
+                <w:rFonts w:ascii="Consolas" w:cs="Consolas" w:eastAsia="Consolas" w:hAnsi="Consolas"/>
+                <w:color w:val="2F3A46"/>
+                <w:sz w:val="22"/>
+                <w:szCs w:val="22"/>
+              </w:rPr>
+              <w:t xml:space="preserve">memory</w:t>
+            </w:r>
+            <w:r>
+              <w:rPr>
+                <w:rFonts w:ascii="Times New Roman" w:cs="Times New Roman" w:eastAsia="Times New Roman" w:hAnsi="Times New Roman"/>
+                <w:color w:val="1F1F1F"/>
+                <w:sz w:val="24"/>
+                <w:szCs w:val="24"/>
+              </w:rPr>
+              <w:t xml:space="preserve"> cho ngữ cảnh dài</w:t>
             </w:r>
           </w:p>
         </w:tc>
@@ -999,6 +1114,32 @@
           <w:sz w:val="22"/>
           <w:szCs w:val="22"/>
         </w:rPr>
+        <w:t xml:space="preserve">gengram/minimal-replication-plan.md</w:t>
+      </w:r>
+    </w:p>
+    <w:p>
+      <w:pPr>
+        <w:spacing w:after="80" w:line="320"/>
+        <w:ind w:left="720" w:hanging="360"/>
+      </w:pPr>
+      <w:r>
+        <w:rPr>
+          <w:rFonts w:ascii="Times New Roman" w:cs="Times New Roman" w:eastAsia="Times New Roman" w:hAnsi="Times New Roman"/>
+          <w:b/>
+          <w:bCs/>
+          <w:color w:val="1F1F1F"/>
+          <w:sz w:val="24"/>
+          <w:szCs w:val="24"/>
+        </w:rPr>
+        <w:t xml:space="preserve">5. </w:t>
+      </w:r>
+      <w:r>
+        <w:rPr>
+          <w:rFonts w:ascii="Consolas" w:cs="Consolas" w:eastAsia="Consolas" w:hAnsi="Consolas"/>
+          <w:color w:val="2F3A46"/>
+          <w:sz w:val="22"/>
+          <w:szCs w:val="22"/>
+        </w:rPr>
         <w:t xml:space="preserve">gengram/ung-dung-va-tiem-nang.md</w:t>
       </w:r>
     </w:p>
@@ -1072,16 +1213,16 @@
           <w:sz w:val="24"/>
           <w:szCs w:val="24"/>
         </w:rPr>
-        <w:t xml:space="preserve"> hấp dẫn hơn ở góc độ nghiên cứu mới, nhưng mức không chắc chắn cao hơn vì hệ asset hiện phân tán giữa </w:t>
-      </w:r>
-      <w:r>
-        <w:rPr>
-          <w:rFonts w:ascii="Consolas" w:cs="Consolas" w:eastAsia="Consolas" w:hAnsi="Consolas"/>
-          <w:color w:val="2F3A46"/>
-          <w:sz w:val="22"/>
-          <w:szCs w:val="22"/>
-        </w:rPr>
-        <w:t xml:space="preserve">paper page</w:t>
+        <w:t xml:space="preserve"> hấp dẫn hơn ở góc độ nghiên cứu mới, nhưng mức không chắc chắn cao hơn vì cần map giữa </w:t>
+      </w:r>
+      <w:r>
+        <w:rPr>
+          <w:rFonts w:ascii="Consolas" w:cs="Consolas" w:eastAsia="Consolas" w:hAnsi="Consolas"/>
+          <w:color w:val="2F3A46"/>
+          <w:sz w:val="22"/>
+          <w:szCs w:val="22"/>
+        </w:rPr>
+        <w:t xml:space="preserve">paper</w:t>
       </w:r>
       <w:r>
         <w:rPr>
@@ -1108,25 +1249,25 @@
           <w:sz w:val="24"/>
           <w:szCs w:val="24"/>
         </w:rPr>
-        <w:t xml:space="preserve">, và hệ </w:t>
-      </w:r>
-      <w:r>
-        <w:rPr>
-          <w:rFonts w:ascii="Consolas" w:cs="Consolas" w:eastAsia="Consolas" w:hAnsi="Consolas"/>
-          <w:color w:val="2F3A46"/>
-          <w:sz w:val="22"/>
-          <w:szCs w:val="22"/>
-        </w:rPr>
-        <w:t xml:space="preserve">Genos</w:t>
-      </w:r>
-      <w:r>
-        <w:rPr>
-          <w:rFonts w:ascii="Times New Roman" w:cs="Times New Roman" w:eastAsia="Times New Roman" w:hAnsi="Times New Roman"/>
-          <w:color w:val="1F1F1F"/>
-          <w:sz w:val="24"/>
-          <w:szCs w:val="24"/>
-        </w:rPr>
-        <w:t xml:space="preserve">.</w:t>
+        <w:t xml:space="preserve">, </w:t>
+      </w:r>
+      <w:r>
+        <w:rPr>
+          <w:rFonts w:ascii="Consolas" w:cs="Consolas" w:eastAsia="Consolas" w:hAnsi="Consolas"/>
+          <w:color w:val="2F3A46"/>
+          <w:sz w:val="22"/>
+          <w:szCs w:val="22"/>
+        </w:rPr>
+        <w:t xml:space="preserve">repo</w:t>
+      </w:r>
+      <w:r>
+        <w:rPr>
+          <w:rFonts w:ascii="Times New Roman" w:cs="Times New Roman" w:eastAsia="Times New Roman" w:hAnsi="Times New Roman"/>
+          <w:color w:val="1F1F1F"/>
+          <w:sz w:val="24"/>
+          <w:szCs w:val="24"/>
+        </w:rPr>
+        <w:t xml:space="preserve">, và benchmark dataset.</w:t>
       </w:r>
     </w:p>
     <w:p>
@@ -1273,6 +1414,278 @@
           <w:szCs w:val="24"/>
         </w:rPr>
         <w:t xml:space="preserve"> là case đáng đọc.</w:t>
+      </w:r>
+    </w:p>
+    <w:p>
+      <w:pPr>
+        <w:pStyle w:val="ListParagraph"/>
+        <w:numPr>
+          <w:ilvl w:val="0"/>
+          <w:numId w:val="1"/>
+        </w:numPr>
+        <w:spacing w:after="80" w:line="320"/>
+      </w:pPr>
+      <w:r>
+        <w:rPr>
+          <w:rFonts w:ascii="Times New Roman" w:cs="Times New Roman" w:eastAsia="Times New Roman" w:hAnsi="Times New Roman"/>
+          <w:color w:val="1F1F1F"/>
+          <w:sz w:val="24"/>
+          <w:szCs w:val="24"/>
+        </w:rPr>
+        <w:t xml:space="preserve">Với trạng thái hiện tại của workspace, </w:t>
+      </w:r>
+      <w:r>
+        <w:rPr>
+          <w:rFonts w:ascii="Consolas" w:cs="Consolas" w:eastAsia="Consolas" w:hAnsi="Consolas"/>
+          <w:color w:val="2F3A46"/>
+          <w:sz w:val="22"/>
+          <w:szCs w:val="22"/>
+        </w:rPr>
+        <w:t xml:space="preserve">DNABERT-2</w:t>
+      </w:r>
+      <w:r>
+        <w:rPr>
+          <w:rFonts w:ascii="Times New Roman" w:cs="Times New Roman" w:eastAsia="Times New Roman" w:hAnsi="Times New Roman"/>
+          <w:color w:val="1F1F1F"/>
+          <w:sz w:val="24"/>
+          <w:szCs w:val="24"/>
+        </w:rPr>
+        <w:t xml:space="preserve"> đã đủ mức research để sang pilot; </w:t>
+      </w:r>
+      <w:r>
+        <w:rPr>
+          <w:rFonts w:ascii="Consolas" w:cs="Consolas" w:eastAsia="Consolas" w:hAnsi="Consolas"/>
+          <w:color w:val="2F3A46"/>
+          <w:sz w:val="22"/>
+          <w:szCs w:val="22"/>
+        </w:rPr>
+        <w:t xml:space="preserve">Gengram</w:t>
+      </w:r>
+      <w:r>
+        <w:rPr>
+          <w:rFonts w:ascii="Times New Roman" w:cs="Times New Roman" w:eastAsia="Times New Roman" w:hAnsi="Times New Roman"/>
+          <w:color w:val="1F1F1F"/>
+          <w:sz w:val="24"/>
+          <w:szCs w:val="24"/>
+        </w:rPr>
+        <w:t xml:space="preserve"> vừa được bổ sung thêm đường </w:t>
+      </w:r>
+      <w:r>
+        <w:rPr>
+          <w:rFonts w:ascii="Consolas" w:cs="Consolas" w:eastAsia="Consolas" w:hAnsi="Consolas"/>
+          <w:color w:val="2F3A46"/>
+          <w:sz w:val="22"/>
+          <w:szCs w:val="22"/>
+        </w:rPr>
+        <w:t xml:space="preserve">minimal replication</w:t>
+      </w:r>
+      <w:r>
+        <w:rPr>
+          <w:rFonts w:ascii="Times New Roman" w:cs="Times New Roman" w:eastAsia="Times New Roman" w:hAnsi="Times New Roman"/>
+          <w:color w:val="1F1F1F"/>
+          <w:sz w:val="24"/>
+          <w:szCs w:val="24"/>
+        </w:rPr>
+        <w:t xml:space="preserve">, nhưng vẫn là topic nên đi sau.</w:t>
+      </w:r>
+    </w:p>
+    <w:p>
+      <w:pPr>
+        <w:pStyle w:val="Heading2"/>
+        <w:spacing w:after="120" w:before="260"/>
+      </w:pPr>
+      <w:r>
+        <w:rPr>
+          <w:rFonts w:ascii="Times New Roman" w:cs="Times New Roman" w:eastAsia="Times New Roman" w:hAnsi="Times New Roman"/>
+          <w:b/>
+          <w:bCs/>
+          <w:color w:val="1F4E79"/>
+          <w:sz w:val="28"/>
+          <w:szCs w:val="28"/>
+        </w:rPr>
+        <w:t xml:space="preserve">Trạng thái chạy thực tế</w:t>
+      </w:r>
+    </w:p>
+    <w:p>
+      <w:pPr>
+        <w:spacing w:after="140" w:line="360"/>
+        <w:jc w:val="both"/>
+      </w:pPr>
+      <w:r>
+        <w:rPr>
+          <w:rFonts w:ascii="Times New Roman" w:cs="Times New Roman" w:eastAsia="Times New Roman" w:hAnsi="Times New Roman"/>
+          <w:color w:val="1F1F1F"/>
+          <w:sz w:val="24"/>
+          <w:szCs w:val="24"/>
+        </w:rPr>
+        <w:t xml:space="preserve">Xem </w:t>
+      </w:r>
+      <w:r>
+        <w:rPr>
+          <w:rFonts w:ascii="Consolas" w:cs="Consolas" w:eastAsia="Consolas" w:hAnsi="Consolas"/>
+          <w:color w:val="2F3A46"/>
+          <w:sz w:val="22"/>
+          <w:szCs w:val="22"/>
+        </w:rPr>
+        <w:t xml:space="preserve">execution-status.md</w:t>
+      </w:r>
+      <w:r>
+        <w:rPr>
+          <w:rFonts w:ascii="Times New Roman" w:cs="Times New Roman" w:eastAsia="Times New Roman" w:hAnsi="Times New Roman"/>
+          <w:color w:val="1F1F1F"/>
+          <w:sz w:val="24"/>
+          <w:szCs w:val="24"/>
+        </w:rPr>
+        <w:t xml:space="preserve"> để biết:</w:t>
+      </w:r>
+    </w:p>
+    <w:p>
+      <w:pPr>
+        <w:pStyle w:val="ListParagraph"/>
+        <w:numPr>
+          <w:ilvl w:val="0"/>
+          <w:numId w:val="1"/>
+        </w:numPr>
+        <w:spacing w:after="80" w:line="320"/>
+      </w:pPr>
+      <w:r>
+        <w:rPr>
+          <w:rFonts w:ascii="Times New Roman" w:cs="Times New Roman" w:eastAsia="Times New Roman" w:hAnsi="Times New Roman"/>
+          <w:color w:val="1F1F1F"/>
+          <w:sz w:val="24"/>
+          <w:szCs w:val="24"/>
+        </w:rPr>
+        <w:t xml:space="preserve">môi trường </w:t>
+      </w:r>
+      <w:r>
+        <w:rPr>
+          <w:rFonts w:ascii="Consolas" w:cs="Consolas" w:eastAsia="Consolas" w:hAnsi="Consolas"/>
+          <w:color w:val="2F3A46"/>
+          <w:sz w:val="22"/>
+          <w:szCs w:val="22"/>
+        </w:rPr>
+        <w:t xml:space="preserve">conda</w:t>
+      </w:r>
+      <w:r>
+        <w:rPr>
+          <w:rFonts w:ascii="Times New Roman" w:cs="Times New Roman" w:eastAsia="Times New Roman" w:hAnsi="Times New Roman"/>
+          <w:color w:val="1F1F1F"/>
+          <w:sz w:val="24"/>
+          <w:szCs w:val="24"/>
+        </w:rPr>
+        <w:t xml:space="preserve"> nào đã được tạo;</w:t>
+      </w:r>
+    </w:p>
+    <w:p>
+      <w:pPr>
+        <w:pStyle w:val="ListParagraph"/>
+        <w:numPr>
+          <w:ilvl w:val="0"/>
+          <w:numId w:val="1"/>
+        </w:numPr>
+        <w:spacing w:after="80" w:line="320"/>
+      </w:pPr>
+      <w:r>
+        <w:rPr>
+          <w:rFonts w:ascii="Times New Roman" w:cs="Times New Roman" w:eastAsia="Times New Roman" w:hAnsi="Times New Roman"/>
+          <w:color w:val="1F1F1F"/>
+          <w:sz w:val="24"/>
+          <w:szCs w:val="24"/>
+        </w:rPr>
+        <w:t xml:space="preserve">repo nào đã clone;</w:t>
+      </w:r>
+    </w:p>
+    <w:p>
+      <w:pPr>
+        <w:pStyle w:val="ListParagraph"/>
+        <w:numPr>
+          <w:ilvl w:val="0"/>
+          <w:numId w:val="1"/>
+        </w:numPr>
+        <w:spacing w:after="80" w:line="320"/>
+      </w:pPr>
+      <w:r>
+        <w:rPr>
+          <w:rFonts w:ascii="Times New Roman" w:cs="Times New Roman" w:eastAsia="Times New Roman" w:hAnsi="Times New Roman"/>
+          <w:color w:val="1F1F1F"/>
+          <w:sz w:val="24"/>
+          <w:szCs w:val="24"/>
+        </w:rPr>
+        <w:t xml:space="preserve">lệnh nào đã chạy thành công;</w:t>
+      </w:r>
+    </w:p>
+    <w:p>
+      <w:pPr>
+        <w:pStyle w:val="ListParagraph"/>
+        <w:numPr>
+          <w:ilvl w:val="0"/>
+          <w:numId w:val="1"/>
+        </w:numPr>
+        <w:spacing w:after="80" w:line="320"/>
+      </w:pPr>
+      <w:r>
+        <w:rPr>
+          <w:rFonts w:ascii="Times New Roman" w:cs="Times New Roman" w:eastAsia="Times New Roman" w:hAnsi="Times New Roman"/>
+          <w:color w:val="1F1F1F"/>
+          <w:sz w:val="24"/>
+          <w:szCs w:val="24"/>
+        </w:rPr>
+        <w:t xml:space="preserve">kết quả thực tế của </w:t>
+      </w:r>
+      <w:r>
+        <w:rPr>
+          <w:rFonts w:ascii="Consolas" w:cs="Consolas" w:eastAsia="Consolas" w:hAnsi="Consolas"/>
+          <w:color w:val="2F3A46"/>
+          <w:sz w:val="22"/>
+          <w:szCs w:val="22"/>
+        </w:rPr>
+        <w:t xml:space="preserve">DNABERT-2</w:t>
+      </w:r>
+      <w:r>
+        <w:rPr>
+          <w:rFonts w:ascii="Times New Roman" w:cs="Times New Roman" w:eastAsia="Times New Roman" w:hAnsi="Times New Roman"/>
+          <w:color w:val="1F1F1F"/>
+          <w:sz w:val="24"/>
+          <w:szCs w:val="24"/>
+        </w:rPr>
+        <w:t xml:space="preserve">;</w:t>
+      </w:r>
+    </w:p>
+    <w:p>
+      <w:pPr>
+        <w:pStyle w:val="ListParagraph"/>
+        <w:numPr>
+          <w:ilvl w:val="0"/>
+          <w:numId w:val="1"/>
+        </w:numPr>
+        <w:spacing w:after="80" w:line="320"/>
+      </w:pPr>
+      <w:r>
+        <w:rPr>
+          <w:rFonts w:ascii="Times New Roman" w:cs="Times New Roman" w:eastAsia="Times New Roman" w:hAnsi="Times New Roman"/>
+          <w:color w:val="1F1F1F"/>
+          <w:sz w:val="24"/>
+          <w:szCs w:val="24"/>
+        </w:rPr>
+        <w:t xml:space="preserve">mức chạy thật hiện đạt được của </w:t>
+      </w:r>
+      <w:r>
+        <w:rPr>
+          <w:rFonts w:ascii="Consolas" w:cs="Consolas" w:eastAsia="Consolas" w:hAnsi="Consolas"/>
+          <w:color w:val="2F3A46"/>
+          <w:sz w:val="22"/>
+          <w:szCs w:val="22"/>
+        </w:rPr>
+        <w:t xml:space="preserve">Gengram</w:t>
+      </w:r>
+      <w:r>
+        <w:rPr>
+          <w:rFonts w:ascii="Times New Roman" w:cs="Times New Roman" w:eastAsia="Times New Roman" w:hAnsi="Times New Roman"/>
+          <w:color w:val="1F1F1F"/>
+          <w:sz w:val="24"/>
+          <w:szCs w:val="24"/>
+        </w:rPr>
+        <w:t xml:space="preserve">.</w:t>
       </w:r>
     </w:p>
     <w:sectPr>

</xml_diff>